<commit_message>
backup: tự động 23/10/2026 08:20 (45 tệp)
</commit_message>
<xml_diff>
--- a/30-Ket-Qua/2026-10-21/Bao-cao/BC_Tiep-thu-giai-trinh-lan-5-De-an-Dang-kiem_20261021_v5_du-thao.docx
+++ b/30-Ket-Qua/2026-10-21/Bao-cao/BC_Tiep-thu-giai-trinh-lan-5-De-an-Dang-kiem_20261021_v5_du-thao.docx
@@ -417,6 +417,7 @@
     <w:p>
       <w:pPr>
         <w:spacing w:after="0"/>
+        <w:ind w:left="720" w:firstLine="720"/>
         <w:rPr>
           <w:b/>
           <w:color w:val="FF0000"/>
@@ -1221,22 +1222,22 @@
               </w:rPr>
               <w:t xml:space="preserve">b) Tiếp thu điều chỉnh quy mô: Nhà trường cập nhật dự báo nhu cầu kiểm định có tính đến năng lực của Trung tâm 82.01.S và dự án An Phú Đăk Hà, và điều chỉnh quy mô theo hướng phân kỳ đầu tư: giai đoạn 1 đầu tư 01 dây chuyền kiểm định tổng hợp (loại I và loại II, trong đó thiết bị kiểm tra phanh tổng hợp có chức năng kiểm tra xe dẫn động bốn bánh toàn thời gian) để kiểm định được cả xe con, xe bán tải (pickup), xe tải van, xe điện và xe tải, xe khách; dây chuyền thứ hai chỉ đầu tư khi lưu lượng thực tế của dây chuyền giai đoạn 1 </w:t>
             </w:r>
-            <w:del w:id="1001" w:author="Nội dung điều chỉnh (Claude)" w:date="2026-10-21T11:03:51Z">
+            <w:del w:id="0" w:author="Nội dung điều chỉnh (Claude)" w:date="2026-10-21T11:03:00Z">
               <w:r>
                 <w:rPr>
                   <w:bCs/>
                   <w:color w:val="00B050"/>
                 </w:rPr>
-                <w:delText xml:space="preserve">vượt ngưỡng 15.000 lượt/năm (công suất thiết kế 01 dây chuyền khoảng 14.976 lượt/năm)</w:delText>
+                <w:delText>vượt ngưỡng 15.000 lượt/năm (công suất thiết kế 01 dây chuyền khoảng 14.976 lượt/năm)</w:delText>
               </w:r>
             </w:del>
-            <w:ins w:id="1002" w:author="Nội dung điều chỉnh (Claude)" w:date="2026-10-21T11:03:51Z">
+            <w:ins w:id="1" w:author="Nội dung điều chỉnh (Claude)" w:date="2026-10-21T11:03:00Z">
               <w:r>
                 <w:rPr>
                   <w:bCs/>
                   <w:color w:val="00B050"/>
                 </w:rPr>
-                <w:t xml:space="preserve">đạt từ 90% công suất thiết kế (14.976 lượt/năm) trong 2 năm liên tiếp</w:t>
+                <w:t>đạt từ 90% công suất thiết kế (14.976 lượt/năm) trong 2 năm liên tiếp</w:t>
               </w:r>
             </w:ins>
             <w:r>
@@ -1244,7 +1245,7 @@
                 <w:bCs/>
                 <w:color w:val="00B050"/>
               </w:rPr>
-              <w:t xml:space="preserve">. Diện tích mặt bằng vẫn bảo đảm điều kiện cho 02 dây chuyền theo khoản 1 Điều 5 Nghị định số 89/2026/NĐ-CP (dự phòng trường hợp đầu tư phát triển, nâng cấp chuyển kiểm định). Tổng vốn đầu tư, vốn điều lệ, Bảng 15, 18, 19, 20 và thời gian hoàn vốn được tính lại tương ứng.</w:t>
+              <w:t>. Diện tích mặt bằng vẫn bảo đảm điều kiện cho 02 dây chuyền theo khoản 1 Điều 5 Nghị định số 89/2026/NĐ-CP (dự phòng trường hợp đầu tư phát triển, nâng cấp chuyển kiểm định). Tổng vốn đầu tư, vốn điều lệ, Bảng 15, 18, 19, 20 và thời gian hoàn vốn được tính lại tương ứng.</w:t>
             </w:r>
           </w:p>
           <w:p>

</xml_diff>